<commit_message>
Counsellor copy as a Google Doc; drop an invented detail
- Adds the Google Docs build (google-doc.html, gdoc_html.py) and a
  word-for-word checker for the uploaded doc (verify_gdoc.py).
- Removes "a call sheet and a light meter in the same hand" from the
  USC Writing autobiographical sketch: the light meter was not in the
  source and the line was a flourish. Counts updated (409 and 407 words).
- README points to the Google Doc as the main counsellor copy.

Co-Authored-By: Claude Opus 5.5 <noreply@anthropic.com>
Claude-Session: https://claude.ai/code/session_01BgYVzuYnfNLkWND4byC5gc
</commit_message>
<xml_diff>
--- a/essays/counsellor/Karan Chaudhary - Fall 2027 Application Essays.docx
+++ b/essays/counsellor/Karan Chaudhary - Fall 2027 Application Essays.docx
@@ -2940,7 +2940,7 @@
       <w:pPr/>
       <w:r>
         <w:rPr/>
-        <w:t>Now he is a camera assistant on a project under Boney Kapoor. On set he holds a call sheet and a light meter in the same hand, and he has stopped thinking of them as different things. He has not yet worked where the money and the schedule behind that call sheet are decided. He plans to build a studio in India, with a team of 8 to 30.</w:t>
+        <w:t>Now he is a camera assistant on a project under Boney Kapoor. He has not yet worked where the money and the schedule behind a call sheet are decided. He plans to build a studio in India, with a team of 8 to 30.</w:t>
       </w:r>
     </w:p>
     <w:p>
@@ -2949,7 +2949,7 @@
       </w:pPr>
       <w:r>
         <w:rPr/>
-        <w:t>434 words  ·  limit: 1 to 2 pages</w:t>
+        <w:t>409 words  ·  limit: 1 to 2 pages</w:t>
       </w:r>
     </w:p>
     <w:p>

</xml_diff>